<commit_message>
Adding hws 13-15, adding ai attestation to all assignments
</commit_message>
<xml_diff>
--- a/homework/hw-02_MH.docx
+++ b/homework/hw-02_MH.docx
@@ -26,7 +26,25 @@
         <w:t xml:space="preserve">Due: Wednesday, June 24 at 11:59pm</w:t>
       </w:r>
     </w:p>
-    <w:bookmarkStart w:id="9" w:name="starting-a-new-quarto-file"/>
+    <w:bookmarkStart w:id="9" w:name="ai-use"/>
+    <w:p>
+      <w:pPr>
+        <w:pStyle w:val="Heading2"/>
+      </w:pPr>
+      <w:r>
+        <w:t xml:space="preserve">AI use</w:t>
+      </w:r>
+    </w:p>
+    <w:p>
+      <w:pPr>
+        <w:pStyle w:val="FirstParagraph"/>
+      </w:pPr>
+      <w:r>
+        <w:t xml:space="preserve">Refer to the syllabus for our AI use policy. You will be asked to include any AI prompts used in this assignment at the end.</w:t>
+      </w:r>
+    </w:p>
+    <w:bookmarkEnd w:id="9"/>
+    <w:bookmarkStart w:id="10" w:name="starting-a-new-quarto-file"/>
     <w:p>
       <w:pPr>
         <w:pStyle w:val="Heading2"/>
@@ -255,8 +273,8 @@
         <w:t xml:space="preserve">. Keep it in your project folder. You’re ready to begin!</w:t>
       </w:r>
     </w:p>
-    <w:bookmarkEnd w:id="9"/>
-    <w:bookmarkStart w:id="13" w:name="dementia-and-eating-behaviors"/>
+    <w:bookmarkEnd w:id="10"/>
+    <w:bookmarkStart w:id="14" w:name="dementia-and-eating-behaviors"/>
     <w:p>
       <w:pPr>
         <w:pStyle w:val="Heading2"/>
@@ -300,18 +318,18 @@
           <wp:inline>
             <wp:extent cx="5334000" cy="3932232"/>
             <wp:effectExtent b="0" l="0" r="0" t="0"/>
-            <wp:docPr descr="" title="" id="11" name="Picture"/>
+            <wp:docPr descr="" title="" id="12" name="Picture"/>
             <a:graphic>
               <a:graphicData uri="http://schemas.openxmlformats.org/drawingml/2006/picture">
                 <pic:pic>
                   <pic:nvPicPr>
-                    <pic:cNvPr descr="images/hw-1/calorie.png" id="12" name="Picture"/>
+                    <pic:cNvPr descr="images/hw-1/calorie.png" id="13" name="Picture"/>
                     <pic:cNvPicPr>
                       <a:picLocks noChangeArrowheads="1" noChangeAspect="1"/>
                     </pic:cNvPicPr>
                   </pic:nvPicPr>
                   <pic:blipFill>
-                    <a:blip r:embed="rId10"/>
+                    <a:blip r:embed="rId11"/>
                     <a:stretch>
                       <a:fillRect/>
                     </a:stretch>
@@ -338,8 +356,8 @@
         </w:drawing>
       </w:r>
     </w:p>
-    <w:bookmarkEnd w:id="13"/>
-    <w:bookmarkStart w:id="14" w:name="exercise-1"/>
+    <w:bookmarkEnd w:id="14"/>
+    <w:bookmarkStart w:id="15" w:name="exercise-1"/>
     <w:p>
       <w:pPr>
         <w:pStyle w:val="Heading2"/>
@@ -397,8 +415,8 @@
         <w:t xml:space="preserve">to be reproducible and replicable.</w:t>
       </w:r>
     </w:p>
-    <w:bookmarkEnd w:id="14"/>
-    <w:bookmarkStart w:id="15" w:name="exercise-2"/>
+    <w:bookmarkEnd w:id="15"/>
+    <w:bookmarkStart w:id="16" w:name="exercise-2"/>
     <w:p>
       <w:pPr>
         <w:pStyle w:val="Heading2"/>
@@ -496,8 +514,8 @@
         <w:t xml:space="preserve">Frontal Rating Scale (mild/moderate/severe)</w:t>
       </w:r>
     </w:p>
-    <w:bookmarkEnd w:id="15"/>
-    <w:bookmarkStart w:id="16" w:name="exercise-3"/>
+    <w:bookmarkEnd w:id="16"/>
+    <w:bookmarkStart w:id="17" w:name="exercise-3"/>
     <w:p>
       <w:pPr>
         <w:pStyle w:val="Heading2"/>
@@ -528,8 +546,8 @@
         <w:t xml:space="preserve">Describe an appropriate visualization that summarizes the total caloric intake at the breakfast buffet, disease duration in years, and type of dementia among these study participants.</w:t>
       </w:r>
     </w:p>
-    <w:bookmarkEnd w:id="16"/>
-    <w:bookmarkStart w:id="17" w:name="exercise-4"/>
+    <w:bookmarkEnd w:id="17"/>
+    <w:bookmarkStart w:id="18" w:name="exercise-4"/>
     <w:p>
       <w:pPr>
         <w:pStyle w:val="Heading2"/>
@@ -570,8 +588,32 @@
         <w:t xml:space="preserve">Suppose the authors wanted to “tell a story” with the title to their visualization. Suggest a more effective title than the one presented.</w:t>
       </w:r>
     </w:p>
-    <w:bookmarkEnd w:id="17"/>
-    <w:bookmarkStart w:id="18" w:name="submission"/>
+    <w:bookmarkEnd w:id="18"/>
+    <w:bookmarkStart w:id="19" w:name="ai-attestation"/>
+    <w:p>
+      <w:pPr>
+        <w:pStyle w:val="Heading2"/>
+      </w:pPr>
+      <w:r>
+        <w:t xml:space="preserve">AI Attestation</w:t>
+      </w:r>
+    </w:p>
+    <w:p>
+      <w:pPr>
+        <w:pStyle w:val="FirstParagraph"/>
+      </w:pPr>
+      <w:r>
+        <w:t xml:space="preserve">Was AI used on this assignment? If so, describe your prompts below. If not, simply state</w:t>
+      </w:r>
+      <w:r>
+        <w:t xml:space="preserve"> </w:t>
+      </w:r>
+      <w:r>
+        <w:t xml:space="preserve">“AI was not used on this assignment.”</w:t>
+      </w:r>
+    </w:p>
+    <w:bookmarkEnd w:id="19"/>
+    <w:bookmarkStart w:id="20" w:name="submission"/>
     <w:p>
       <w:pPr>
         <w:pStyle w:val="Heading2"/>
@@ -601,7 +643,7 @@
         <w:t xml:space="preserve"> </w:t>
       </w:r>
       <w:r>
-        <w:t xml:space="preserve">into an .html file that can be opened by any web browser. To export it as a .pdf, open the file in your web browser and then print to or save as a .pdf document. Contact your TAs in Ed Discussion if you need help!</w:t>
+        <w:t xml:space="preserve">into an .html file that can be opened by any web browser. To export it as a .pdf, open the file in your web browser and then print to or save as a .pdf document. Contact me in Ed Discussion if you need help!</w:t>
       </w:r>
     </w:p>
     <w:p>
@@ -676,8 +718,8 @@
         <w:t xml:space="preserve">section.</w:t>
       </w:r>
     </w:p>
-    <w:bookmarkEnd w:id="18"/>
-    <w:bookmarkStart w:id="19" w:name="grading"/>
+    <w:bookmarkEnd w:id="20"/>
+    <w:bookmarkStart w:id="21" w:name="grading"/>
     <w:p>
       <w:pPr>
         <w:pStyle w:val="Heading2"/>
@@ -827,6 +869,30 @@
               <w:pStyle w:val="Compact"/>
             </w:pPr>
             <w:r>
+              <w:t xml:space="preserve">AI Attestation</w:t>
+            </w:r>
+          </w:p>
+        </w:tc>
+        <w:tc>
+          <w:tcPr/>
+          <w:p>
+            <w:pPr>
+              <w:pStyle w:val="Compact"/>
+            </w:pPr>
+            <w:r>
+              <w:t xml:space="preserve">1</w:t>
+            </w:r>
+          </w:p>
+        </w:tc>
+      </w:tr>
+      <w:tr>
+        <w:tc>
+          <w:tcPr/>
+          <w:p>
+            <w:pPr>
+              <w:pStyle w:val="Compact"/>
+            </w:pPr>
+            <w:r>
               <w:t xml:space="preserve">Formatting</w:t>
             </w:r>
           </w:p>
@@ -852,7 +918,7 @@
         <w:t xml:space="preserve">The “Formatting” grade is to assess the document format. This includes having a neatly organized document (no excessive output, warnings/messages when loading packages and/or data) with readable code and your name and the date updated in the YAML.</w:t>
       </w:r>
     </w:p>
-    <w:bookmarkEnd w:id="19"/>
+    <w:bookmarkEnd w:id="21"/>
     <w:sectPr>
       <w:footnotePr>
         <w:numRestart w:val="eachSect"/>

</xml_diff>

<commit_message>
Updating hw 2, lab 1, lecture 2
</commit_message>
<xml_diff>
--- a/homework/hw-02_MH.docx
+++ b/homework/hw-02_MH.docx
@@ -44,13 +44,13 @@
       </w:r>
     </w:p>
     <w:bookmarkEnd w:id="9"/>
-    <w:bookmarkStart w:id="10" w:name="starting-a-new-quarto-file"/>
+    <w:bookmarkStart w:id="10" w:name="download-the-template"/>
     <w:p>
       <w:pPr>
         <w:pStyle w:val="Heading2"/>
       </w:pPr>
       <w:r>
-        <w:t xml:space="preserve">Starting a new Quarto file</w:t>
+        <w:t xml:space="preserve">Download the template</w:t>
       </w:r>
     </w:p>
     <w:p>
@@ -58,219 +58,7 @@
         <w:pStyle w:val="FirstParagraph"/>
       </w:pPr>
       <w:r>
-        <w:t xml:space="preserve">For this assignment (and all future assignments) you will begin a new Quarto file. To do this, open RStudio and make sure you are inside your course project folder with File &gt; Open Project &gt; …. To create a new Quarto file, go to the top menu and click File &gt; New File &gt; Quarto Document. A pop-up will appear asking for a title, author, and format. You may leave these as the default options for now. Click OK and a new file will open.</w:t>
-      </w:r>
-    </w:p>
-    <w:p>
-      <w:pPr>
-        <w:pStyle w:val="BodyText"/>
-      </w:pPr>
-      <w:r>
-        <w:t xml:space="preserve">In the document, Quarto automatically adds some starter text and code chunks. You may delete everything below the YAML header (everything under the second set of</w:t>
-      </w:r>
-      <w:r>
-        <w:t xml:space="preserve"> </w:t>
-      </w:r>
-      <w:r>
-        <w:rPr>
-          <w:rStyle w:val="VerbatimChar"/>
-        </w:rPr>
-        <w:t xml:space="preserve">---</w:t>
-      </w:r>
-      <w:r>
-        <w:t xml:space="preserve">). You should be left with just a YAML section at the very top, which looks something like this:</w:t>
-      </w:r>
-    </w:p>
-    <w:p>
-      <w:pPr>
-        <w:pStyle w:val="SourceCode"/>
-      </w:pPr>
-      <w:r>
-        <w:rPr>
-          <w:rStyle w:val="SpecialCharTok"/>
-        </w:rPr>
-        <w:t xml:space="preserve">---</w:t>
-      </w:r>
-      <w:r>
-        <w:br/>
-      </w:r>
-      <w:r>
-        <w:rPr>
-          <w:rStyle w:val="NormalTok"/>
-        </w:rPr>
-        <w:t xml:space="preserve">title</w:t>
-      </w:r>
-      <w:r>
-        <w:rPr>
-          <w:rStyle w:val="SpecialCharTok"/>
-        </w:rPr>
-        <w:t xml:space="preserve">:</w:t>
-      </w:r>
-      <w:r>
-        <w:rPr>
-          <w:rStyle w:val="NormalTok"/>
-        </w:rPr>
-        <w:t xml:space="preserve"> </w:t>
-      </w:r>
-      <w:r>
-        <w:rPr>
-          <w:rStyle w:val="StringTok"/>
-        </w:rPr>
-        <w:t xml:space="preserve">"Document Title"</w:t>
-      </w:r>
-      <w:r>
-        <w:br/>
-      </w:r>
-      <w:r>
-        <w:rPr>
-          <w:rStyle w:val="NormalTok"/>
-        </w:rPr>
-        <w:t xml:space="preserve">author</w:t>
-      </w:r>
-      <w:r>
-        <w:rPr>
-          <w:rStyle w:val="SpecialCharTok"/>
-        </w:rPr>
-        <w:t xml:space="preserve">:</w:t>
-      </w:r>
-      <w:r>
-        <w:rPr>
-          <w:rStyle w:val="NormalTok"/>
-        </w:rPr>
-        <w:t xml:space="preserve"> </w:t>
-      </w:r>
-      <w:r>
-        <w:rPr>
-          <w:rStyle w:val="StringTok"/>
-        </w:rPr>
-        <w:t xml:space="preserve">"Your Name"</w:t>
-      </w:r>
-      <w:r>
-        <w:br/>
-      </w:r>
-      <w:r>
-        <w:rPr>
-          <w:rStyle w:val="NormalTok"/>
-        </w:rPr>
-        <w:t xml:space="preserve">date</w:t>
-      </w:r>
-      <w:r>
-        <w:rPr>
-          <w:rStyle w:val="SpecialCharTok"/>
-        </w:rPr>
-        <w:t xml:space="preserve">:</w:t>
-      </w:r>
-      <w:r>
-        <w:rPr>
-          <w:rStyle w:val="NormalTok"/>
-        </w:rPr>
-        <w:t xml:space="preserve"> </w:t>
-      </w:r>
-      <w:r>
-        <w:rPr>
-          <w:rStyle w:val="StringTok"/>
-        </w:rPr>
-        <w:t xml:space="preserve">"2026-06-24"</w:t>
-      </w:r>
-      <w:r>
-        <w:br/>
-      </w:r>
-      <w:r>
-        <w:rPr>
-          <w:rStyle w:val="NormalTok"/>
-        </w:rPr>
-        <w:t xml:space="preserve">format</w:t>
-      </w:r>
-      <w:r>
-        <w:rPr>
-          <w:rStyle w:val="SpecialCharTok"/>
-        </w:rPr>
-        <w:t xml:space="preserve">:</w:t>
-      </w:r>
-      <w:r>
-        <w:rPr>
-          <w:rStyle w:val="NormalTok"/>
-        </w:rPr>
-        <w:t xml:space="preserve"> html</w:t>
-      </w:r>
-      <w:r>
-        <w:br/>
-      </w:r>
-      <w:r>
-        <w:rPr>
-          <w:rStyle w:val="SpecialCharTok"/>
-        </w:rPr>
-        <w:t xml:space="preserve">---</w:t>
-      </w:r>
-    </w:p>
-    <w:p>
-      <w:pPr>
-        <w:pStyle w:val="FirstParagraph"/>
-      </w:pPr>
-      <w:r>
-        <w:t xml:space="preserve">Now, Edit the YAML header. Change</w:t>
-      </w:r>
-    </w:p>
-    <w:p>
-      <w:pPr>
-        <w:numPr>
-          <w:ilvl w:val="0"/>
-          <w:numId w:val="1001"/>
-        </w:numPr>
-      </w:pPr>
-      <w:r>
-        <w:t xml:space="preserve">title -&gt; the assignment name (e.g. </w:t>
-      </w:r>
-      <w:r>
-        <w:rPr>
-          <w:rStyle w:val="VerbatimChar"/>
-        </w:rPr>
-        <w:t xml:space="preserve">HW 1</w:t>
-      </w:r>
-      <w:r>
-        <w:t xml:space="preserve">)</w:t>
-      </w:r>
-    </w:p>
-    <w:p>
-      <w:pPr>
-        <w:numPr>
-          <w:ilvl w:val="0"/>
-          <w:numId w:val="1001"/>
-        </w:numPr>
-      </w:pPr>
-      <w:r>
-        <w:t xml:space="preserve">author -&gt; your name</w:t>
-      </w:r>
-    </w:p>
-    <w:p>
-      <w:pPr>
-        <w:numPr>
-          <w:ilvl w:val="0"/>
-          <w:numId w:val="1001"/>
-        </w:numPr>
-      </w:pPr>
-      <w:r>
-        <w:t xml:space="preserve">date -&gt; today’s date</w:t>
-      </w:r>
-    </w:p>
-    <w:p>
-      <w:pPr>
-        <w:pStyle w:val="FirstParagraph"/>
-      </w:pPr>
-      <w:r>
-        <w:t xml:space="preserve">Now, save your file. Go to File &gt; Save as, and name it something clear like</w:t>
-      </w:r>
-      <w:r>
-        <w:t xml:space="preserve"> </w:t>
-      </w:r>
-      <w:r>
-        <w:rPr>
-          <w:rStyle w:val="VerbatimChar"/>
-        </w:rPr>
-        <w:t xml:space="preserve">hw1.qmd</w:t>
-      </w:r>
-      <w:r>
-        <w:t xml:space="preserve">. Keep it in your project folder. You’re ready to begin!</w:t>
+        <w:t xml:space="preserve">You can find the template for this assignment on Canvas; download it to your project folder.</w:t>
       </w:r>
     </w:p>
     <w:bookmarkEnd w:id="10"/>
@@ -370,7 +158,7 @@
       <w:pPr>
         <w:numPr>
           <w:ilvl w:val="0"/>
-          <w:numId w:val="1002"/>
+          <w:numId w:val="1001"/>
         </w:numPr>
       </w:pPr>
       <w:r>
@@ -381,7 +169,7 @@
       <w:pPr>
         <w:numPr>
           <w:ilvl w:val="0"/>
-          <w:numId w:val="1002"/>
+          <w:numId w:val="1001"/>
         </w:numPr>
       </w:pPr>
       <w:r>
@@ -392,7 +180,7 @@
       <w:pPr>
         <w:numPr>
           <w:ilvl w:val="0"/>
-          <w:numId w:val="1002"/>
+          <w:numId w:val="1001"/>
         </w:numPr>
       </w:pPr>
       <w:r>
@@ -459,7 +247,7 @@
         <w:pStyle w:val="Compact"/>
         <w:numPr>
           <w:ilvl w:val="0"/>
-          <w:numId w:val="1003"/>
+          <w:numId w:val="1002"/>
         </w:numPr>
       </w:pPr>
       <w:r>
@@ -469,59 +257,91 @@
     <w:p>
       <w:pPr>
         <w:pStyle w:val="Compact"/>
+        <w:numPr>
+          <w:ilvl w:val="0"/>
+          <w:numId w:val="1002"/>
+        </w:numPr>
+      </w:pPr>
+      <w:r>
+        <w:t xml:space="preserve">Total caloric intake</w:t>
+      </w:r>
+    </w:p>
+    <w:p>
+      <w:pPr>
+        <w:pStyle w:val="Compact"/>
+        <w:numPr>
+          <w:ilvl w:val="0"/>
+          <w:numId w:val="1002"/>
+        </w:numPr>
+      </w:pPr>
+      <w:r>
+        <w:t xml:space="preserve">% of calories from sugar</w:t>
+      </w:r>
+    </w:p>
+    <w:p>
+      <w:pPr>
+        <w:pStyle w:val="Compact"/>
+        <w:numPr>
+          <w:ilvl w:val="0"/>
+          <w:numId w:val="1002"/>
+        </w:numPr>
+      </w:pPr>
+      <w:r>
+        <w:t xml:space="preserve">Disease duration</w:t>
+      </w:r>
+    </w:p>
+    <w:p>
+      <w:pPr>
+        <w:pStyle w:val="Compact"/>
+        <w:numPr>
+          <w:ilvl w:val="0"/>
+          <w:numId w:val="1002"/>
+        </w:numPr>
+      </w:pPr>
+      <w:r>
+        <w:t xml:space="preserve">Frontal Rating Scale (mild/moderate/severe)</w:t>
+      </w:r>
+    </w:p>
+    <w:bookmarkEnd w:id="16"/>
+    <w:bookmarkStart w:id="17" w:name="exercise-3"/>
+    <w:p>
+      <w:pPr>
+        <w:pStyle w:val="Heading2"/>
+      </w:pPr>
+      <w:r>
+        <w:t xml:space="preserve">Exercise 3</w:t>
+      </w:r>
+    </w:p>
+    <w:p>
+      <w:pPr>
         <w:numPr>
           <w:ilvl w:val="0"/>
           <w:numId w:val="1003"/>
         </w:numPr>
       </w:pPr>
       <w:r>
-        <w:t xml:space="preserve">Total caloric intake</w:t>
-      </w:r>
-    </w:p>
-    <w:p>
-      <w:pPr>
-        <w:pStyle w:val="Compact"/>
+        <w:t xml:space="preserve">Describe an appropriate visualization that summarizes the % of calories from sugar at the breakfast buffet to the Frontal Rating Scale of the study participants.</w:t>
+      </w:r>
+    </w:p>
+    <w:p>
+      <w:pPr>
         <w:numPr>
           <w:ilvl w:val="0"/>
           <w:numId w:val="1003"/>
         </w:numPr>
       </w:pPr>
       <w:r>
-        <w:t xml:space="preserve">% of calories from sugar</w:t>
-      </w:r>
-    </w:p>
-    <w:p>
-      <w:pPr>
-        <w:pStyle w:val="Compact"/>
-        <w:numPr>
-          <w:ilvl w:val="0"/>
-          <w:numId w:val="1003"/>
-        </w:numPr>
-      </w:pPr>
-      <w:r>
-        <w:t xml:space="preserve">Disease duration</w:t>
-      </w:r>
-    </w:p>
-    <w:p>
-      <w:pPr>
-        <w:pStyle w:val="Compact"/>
-        <w:numPr>
-          <w:ilvl w:val="0"/>
-          <w:numId w:val="1003"/>
-        </w:numPr>
-      </w:pPr>
-      <w:r>
-        <w:t xml:space="preserve">Frontal Rating Scale (mild/moderate/severe)</w:t>
-      </w:r>
-    </w:p>
-    <w:bookmarkEnd w:id="16"/>
-    <w:bookmarkStart w:id="17" w:name="exercise-3"/>
+        <w:t xml:space="preserve">Describe an appropriate visualization that summarizes the total caloric intake at the breakfast buffet, disease duration in years, and type of dementia among these study participants.</w:t>
+      </w:r>
+    </w:p>
+    <w:bookmarkEnd w:id="17"/>
+    <w:bookmarkStart w:id="18" w:name="exercise-4"/>
     <w:p>
       <w:pPr>
         <w:pStyle w:val="Heading2"/>
       </w:pPr>
       <w:r>
-        <w:t xml:space="preserve">Exercise 3</w:t>
+        <w:t xml:space="preserve">Exercise 4</w:t>
       </w:r>
     </w:p>
     <w:p>
@@ -529,38 +349,6 @@
         <w:numPr>
           <w:ilvl w:val="0"/>
           <w:numId w:val="1004"/>
-        </w:numPr>
-      </w:pPr>
-      <w:r>
-        <w:t xml:space="preserve">Describe an appropriate visualization that summarizes the % of calories from sugar at the breakfast buffet to the Frontal Rating Scale of the study participants.</w:t>
-      </w:r>
-    </w:p>
-    <w:p>
-      <w:pPr>
-        <w:numPr>
-          <w:ilvl w:val="0"/>
-          <w:numId w:val="1004"/>
-        </w:numPr>
-      </w:pPr>
-      <w:r>
-        <w:t xml:space="preserve">Describe an appropriate visualization that summarizes the total caloric intake at the breakfast buffet, disease duration in years, and type of dementia among these study participants.</w:t>
-      </w:r>
-    </w:p>
-    <w:bookmarkEnd w:id="17"/>
-    <w:bookmarkStart w:id="18" w:name="exercise-4"/>
-    <w:p>
-      <w:pPr>
-        <w:pStyle w:val="Heading2"/>
-      </w:pPr>
-      <w:r>
-        <w:t xml:space="preserve">Exercise 4</w:t>
-      </w:r>
-    </w:p>
-    <w:p>
-      <w:pPr>
-        <w:numPr>
-          <w:ilvl w:val="0"/>
-          <w:numId w:val="1005"/>
         </w:numPr>
       </w:pPr>
       <w:r>
@@ -581,7 +369,7 @@
       <w:pPr>
         <w:numPr>
           <w:ilvl w:val="0"/>
-          <w:numId w:val="1005"/>
+          <w:numId w:val="1004"/>
         </w:numPr>
       </w:pPr>
       <w:r>
@@ -666,7 +454,7 @@
       <w:pPr>
         <w:numPr>
           <w:ilvl w:val="0"/>
-          <w:numId w:val="1006"/>
+          <w:numId w:val="1005"/>
         </w:numPr>
       </w:pPr>
       <w:r>
@@ -677,7 +465,7 @@
       <w:pPr>
         <w:numPr>
           <w:ilvl w:val="0"/>
-          <w:numId w:val="1006"/>
+          <w:numId w:val="1005"/>
         </w:numPr>
       </w:pPr>
       <w:r>
@@ -688,7 +476,7 @@
       <w:pPr>
         <w:numPr>
           <w:ilvl w:val="0"/>
-          <w:numId w:val="1006"/>
+          <w:numId w:val="1005"/>
         </w:numPr>
       </w:pPr>
       <w:r>
@@ -699,7 +487,7 @@
       <w:pPr>
         <w:numPr>
           <w:ilvl w:val="0"/>
-          <w:numId w:val="1006"/>
+          <w:numId w:val="1005"/>
         </w:numPr>
       </w:pPr>
       <w:r>
@@ -1029,109 +817,6 @@
       </w:pPr>
     </w:lvl>
   </w:abstractNum>
-  <w:abstractNum w:abstractNumId="991">
-    <w:nsid w:val="0000A991"/>
-    <w:multiLevelType w:val="multilevel"/>
-    <w:lvl w:ilvl="0">
-      <w:numFmt w:val="bullet"/>
-      <w:lvlText w:val=""/>
-      <w:lvlJc w:val="left"/>
-      <w:pPr>
-        <w:ind w:left="720" w:hanging="360"/>
-      </w:pPr>
-      <w:rPr>
-        <w:rFonts w:ascii="Symbol" w:hAnsi="Symbol" w:cs="Symbol" w:hint="default"/>
-      </w:rPr>
-    </w:lvl>
-    <w:lvl w:ilvl="1">
-      <w:numFmt w:val="bullet"/>
-      <w:lvlText w:val="o"/>
-      <w:lvlJc w:val="left"/>
-      <w:pPr>
-        <w:ind w:left="1440" w:hanging="360"/>
-      </w:pPr>
-      <w:rPr>
-        <w:rFonts w:ascii="Courier New" w:hAnsi="Courier New" w:cs="Courier New" w:hint="default"/>
-      </w:rPr>
-    </w:lvl>
-    <w:lvl w:ilvl="2">
-      <w:numFmt w:val="bullet"/>
-      <w:lvlText w:val=""/>
-      <w:lvlJc w:val="left"/>
-      <w:pPr>
-        <w:ind w:left="2160" w:hanging="360"/>
-      </w:pPr>
-      <w:rPr>
-        <w:rFonts w:ascii="Wingdings" w:hAnsi="Wingdings" w:cs="Wingdings" w:hint="default"/>
-      </w:rPr>
-    </w:lvl>
-    <w:lvl w:ilvl="3">
-      <w:numFmt w:val="bullet"/>
-      <w:lvlText w:val=""/>
-      <w:lvlJc w:val="left"/>
-      <w:pPr>
-        <w:ind w:left="2880" w:hanging="360"/>
-      </w:pPr>
-      <w:rPr>
-        <w:rFonts w:ascii="Symbol" w:hAnsi="Symbol" w:cs="Symbol" w:hint="default"/>
-      </w:rPr>
-    </w:lvl>
-    <w:lvl w:ilvl="4">
-      <w:numFmt w:val="bullet"/>
-      <w:lvlText w:val="o"/>
-      <w:lvlJc w:val="left"/>
-      <w:pPr>
-        <w:ind w:left="3600" w:hanging="360"/>
-      </w:pPr>
-      <w:rPr>
-        <w:rFonts w:ascii="Courier New" w:hAnsi="Courier New" w:cs="Courier New" w:hint="default"/>
-      </w:rPr>
-    </w:lvl>
-    <w:lvl w:ilvl="5">
-      <w:numFmt w:val="bullet"/>
-      <w:lvlText w:val=""/>
-      <w:lvlJc w:val="left"/>
-      <w:pPr>
-        <w:ind w:left="4320" w:hanging="360"/>
-      </w:pPr>
-      <w:rPr>
-        <w:rFonts w:ascii="Wingdings" w:hAnsi="Wingdings" w:cs="Wingdings" w:hint="default"/>
-      </w:rPr>
-    </w:lvl>
-    <w:lvl w:ilvl="6">
-      <w:numFmt w:val="bullet"/>
-      <w:lvlText w:val=""/>
-      <w:lvlJc w:val="left"/>
-      <w:pPr>
-        <w:ind w:left="5040" w:hanging="360"/>
-      </w:pPr>
-      <w:rPr>
-        <w:rFonts w:ascii="Symbol" w:hAnsi="Symbol" w:cs="Symbol" w:hint="default"/>
-      </w:rPr>
-    </w:lvl>
-    <w:lvl w:ilvl="7">
-      <w:numFmt w:val="bullet"/>
-      <w:lvlText w:val="o"/>
-      <w:lvlJc w:val="left"/>
-      <w:pPr>
-        <w:ind w:left="5760" w:hanging="360"/>
-      </w:pPr>
-      <w:rPr>
-        <w:rFonts w:ascii="Courier New" w:hAnsi="Courier New" w:cs="Courier New" w:hint="default"/>
-      </w:rPr>
-    </w:lvl>
-    <w:lvl w:ilvl="8">
-      <w:numFmt w:val="bullet"/>
-      <w:lvlText w:val=""/>
-      <w:lvlJc w:val="left"/>
-      <w:pPr>
-        <w:ind w:left="6480" w:hanging="360"/>
-      </w:pPr>
-      <w:rPr>
-        <w:rFonts w:ascii="Wingdings" w:hAnsi="Wingdings" w:cs="Wingdings" w:hint="default"/>
-      </w:rPr>
-    </w:lvl>
-  </w:abstractNum>
   <w:abstractNum w:abstractNumId="99711">
     <w:nsid w:val="00A99711"/>
     <w:multiLevelType w:val="multilevel"/>
@@ -1217,13 +902,146 @@
       </w:pPr>
     </w:lvl>
   </w:abstractNum>
+  <w:abstractNum w:abstractNumId="991">
+    <w:nsid w:val="0000A991"/>
+    <w:multiLevelType w:val="multilevel"/>
+    <w:lvl w:ilvl="0">
+      <w:numFmt w:val="bullet"/>
+      <w:lvlText w:val=""/>
+      <w:lvlJc w:val="left"/>
+      <w:pPr>
+        <w:ind w:left="720" w:hanging="360"/>
+      </w:pPr>
+      <w:rPr>
+        <w:rFonts w:ascii="Symbol" w:hAnsi="Symbol" w:cs="Symbol" w:hint="default"/>
+      </w:rPr>
+    </w:lvl>
+    <w:lvl w:ilvl="1">
+      <w:numFmt w:val="bullet"/>
+      <w:lvlText w:val="o"/>
+      <w:lvlJc w:val="left"/>
+      <w:pPr>
+        <w:ind w:left="1440" w:hanging="360"/>
+      </w:pPr>
+      <w:rPr>
+        <w:rFonts w:ascii="Courier New" w:hAnsi="Courier New" w:cs="Courier New" w:hint="default"/>
+      </w:rPr>
+    </w:lvl>
+    <w:lvl w:ilvl="2">
+      <w:numFmt w:val="bullet"/>
+      <w:lvlText w:val=""/>
+      <w:lvlJc w:val="left"/>
+      <w:pPr>
+        <w:ind w:left="2160" w:hanging="360"/>
+      </w:pPr>
+      <w:rPr>
+        <w:rFonts w:ascii="Wingdings" w:hAnsi="Wingdings" w:cs="Wingdings" w:hint="default"/>
+      </w:rPr>
+    </w:lvl>
+    <w:lvl w:ilvl="3">
+      <w:numFmt w:val="bullet"/>
+      <w:lvlText w:val=""/>
+      <w:lvlJc w:val="left"/>
+      <w:pPr>
+        <w:ind w:left="2880" w:hanging="360"/>
+      </w:pPr>
+      <w:rPr>
+        <w:rFonts w:ascii="Symbol" w:hAnsi="Symbol" w:cs="Symbol" w:hint="default"/>
+      </w:rPr>
+    </w:lvl>
+    <w:lvl w:ilvl="4">
+      <w:numFmt w:val="bullet"/>
+      <w:lvlText w:val="o"/>
+      <w:lvlJc w:val="left"/>
+      <w:pPr>
+        <w:ind w:left="3600" w:hanging="360"/>
+      </w:pPr>
+      <w:rPr>
+        <w:rFonts w:ascii="Courier New" w:hAnsi="Courier New" w:cs="Courier New" w:hint="default"/>
+      </w:rPr>
+    </w:lvl>
+    <w:lvl w:ilvl="5">
+      <w:numFmt w:val="bullet"/>
+      <w:lvlText w:val=""/>
+      <w:lvlJc w:val="left"/>
+      <w:pPr>
+        <w:ind w:left="4320" w:hanging="360"/>
+      </w:pPr>
+      <w:rPr>
+        <w:rFonts w:ascii="Wingdings" w:hAnsi="Wingdings" w:cs="Wingdings" w:hint="default"/>
+      </w:rPr>
+    </w:lvl>
+    <w:lvl w:ilvl="6">
+      <w:numFmt w:val="bullet"/>
+      <w:lvlText w:val=""/>
+      <w:lvlJc w:val="left"/>
+      <w:pPr>
+        <w:ind w:left="5040" w:hanging="360"/>
+      </w:pPr>
+      <w:rPr>
+        <w:rFonts w:ascii="Symbol" w:hAnsi="Symbol" w:cs="Symbol" w:hint="default"/>
+      </w:rPr>
+    </w:lvl>
+    <w:lvl w:ilvl="7">
+      <w:numFmt w:val="bullet"/>
+      <w:lvlText w:val="o"/>
+      <w:lvlJc w:val="left"/>
+      <w:pPr>
+        <w:ind w:left="5760" w:hanging="360"/>
+      </w:pPr>
+      <w:rPr>
+        <w:rFonts w:ascii="Courier New" w:hAnsi="Courier New" w:cs="Courier New" w:hint="default"/>
+      </w:rPr>
+    </w:lvl>
+    <w:lvl w:ilvl="8">
+      <w:numFmt w:val="bullet"/>
+      <w:lvlText w:val=""/>
+      <w:lvlJc w:val="left"/>
+      <w:pPr>
+        <w:ind w:left="6480" w:hanging="360"/>
+      </w:pPr>
+      <w:rPr>
+        <w:rFonts w:ascii="Wingdings" w:hAnsi="Wingdings" w:cs="Wingdings" w:hint="default"/>
+      </w:rPr>
+    </w:lvl>
+  </w:abstractNum>
   <w:num w:numId="1000">
     <w:abstractNumId w:val="990"/>
   </w:num>
   <w:num w:numId="1001">
+    <w:abstractNumId w:val="99711"/>
+    <w:lvlOverride w:ilvl="0">
+      <w:startOverride w:val="1"/>
+    </w:lvlOverride>
+    <w:lvlOverride w:ilvl="1">
+      <w:startOverride w:val="1"/>
+    </w:lvlOverride>
+    <w:lvlOverride w:ilvl="2">
+      <w:startOverride w:val="1"/>
+    </w:lvlOverride>
+    <w:lvlOverride w:ilvl="3">
+      <w:startOverride w:val="1"/>
+    </w:lvlOverride>
+    <w:lvlOverride w:ilvl="4">
+      <w:startOverride w:val="1"/>
+    </w:lvlOverride>
+    <w:lvlOverride w:ilvl="5">
+      <w:startOverride w:val="1"/>
+    </w:lvlOverride>
+    <w:lvlOverride w:ilvl="6">
+      <w:startOverride w:val="1"/>
+    </w:lvlOverride>
+    <w:lvlOverride w:ilvl="7">
+      <w:startOverride w:val="1"/>
+    </w:lvlOverride>
+    <w:lvlOverride w:ilvl="8">
+      <w:startOverride w:val="1"/>
+    </w:lvlOverride>
+  </w:num>
+  <w:num w:numId="1002">
     <w:abstractNumId w:val="991"/>
   </w:num>
-  <w:num w:numId="1002">
+  <w:num w:numId="1003">
     <w:abstractNumId w:val="99711"/>
     <w:lvlOverride w:ilvl="0">
       <w:startOverride w:val="1"/>
@@ -1252,9 +1070,6 @@
     <w:lvlOverride w:ilvl="8">
       <w:startOverride w:val="1"/>
     </w:lvlOverride>
-  </w:num>
-  <w:num w:numId="1003">
-    <w:abstractNumId w:val="991"/>
   </w:num>
   <w:num w:numId="1004">
     <w:abstractNumId w:val="99711"/>
@@ -1287,36 +1102,6 @@
     </w:lvlOverride>
   </w:num>
   <w:num w:numId="1005">
-    <w:abstractNumId w:val="99711"/>
-    <w:lvlOverride w:ilvl="0">
-      <w:startOverride w:val="1"/>
-    </w:lvlOverride>
-    <w:lvlOverride w:ilvl="1">
-      <w:startOverride w:val="1"/>
-    </w:lvlOverride>
-    <w:lvlOverride w:ilvl="2">
-      <w:startOverride w:val="1"/>
-    </w:lvlOverride>
-    <w:lvlOverride w:ilvl="3">
-      <w:startOverride w:val="1"/>
-    </w:lvlOverride>
-    <w:lvlOverride w:ilvl="4">
-      <w:startOverride w:val="1"/>
-    </w:lvlOverride>
-    <w:lvlOverride w:ilvl="5">
-      <w:startOverride w:val="1"/>
-    </w:lvlOverride>
-    <w:lvlOverride w:ilvl="6">
-      <w:startOverride w:val="1"/>
-    </w:lvlOverride>
-    <w:lvlOverride w:ilvl="7">
-      <w:startOverride w:val="1"/>
-    </w:lvlOverride>
-    <w:lvlOverride w:ilvl="8">
-      <w:startOverride w:val="1"/>
-    </w:lvlOverride>
-  </w:num>
-  <w:num w:numId="1006">
     <w:abstractNumId w:val="991"/>
   </w:num>
 </w:numbering>

</xml_diff>